<commit_message>
Lunch card: Level 2 voice; refresher: Mr. O keeps additional clothing
</commit_message>
<xml_diff>
--- a/resources/systems/procedures/schoolwide/05-lunch-expectations.docx
+++ b/resources/systems/procedures/schoolwide/05-lunch-expectations.docx
@@ -1956,7 +1956,7 @@
                 <w:szCs w:val="19"/>
                 <w:rtl w:val="0"/>
               </w:rPr>
-              <w:t>Match the level on the screen. Level 3, table voice, is the highest in the cafeteria. Level 4 is for outside only.</w:t>
+              <w:t>Match the level on the screen. Level 2, table voice, is the highest in the cafeteria: only your row can hear you.</w:t>
             </w:r>
             <w:r>
               <w:rPr>
@@ -3536,7 +3536,7 @@
           <w:szCs w:val="21"/>
           <w:rtl w:val="0"/>
         </w:rPr>
-        <w:t>“Watch the screen. The MC shows the voice level. Level 3, table voice, is the loudest we go in here. If you need something, stay at your spot and raise your hand. The Monitor for your row comes to you.”</w:t>
+        <w:t>“Watch the screen. The MC shows the voice level. Level 2, table voice, is the loudest we go in here. Only your row can hear you. If you need something, stay at your spot and raise your hand. The Monitor for your row comes to you.”</w:t>
       </w:r>
       <w:r>
         <w:rPr>
@@ -3569,7 +3569,7 @@
           <w:szCs w:val="21"/>
           <w:rtl w:val="0"/>
         </w:rPr>
-        <w:t>Practice Levels 1, 2, and 3 for five seconds each, then practice the raised hand.</w:t>
+        <w:t>Practice Levels 0, 1, and 2 for five seconds each, then practice the raised hand.</w:t>
       </w:r>
       <w:r>
         <w:rPr>

</xml_diff>